<commit_message>
Refactor prompt engine for dynamic heading injection and update placeholders
</commit_message>
<xml_diff>
--- a/ppt_script.docx
+++ b/ppt_script.docx
@@ -10,23 +10,28 @@
       </w:r>
     </w:p>
     <w:p>
-      <w:pPr>
-        <w:rPr>
-          <w:b/>
-          <w:bCs/>
-        </w:rPr>
-      </w:pPr>
-      <w:r>
-        <w:rPr>
-          <w:b/>
-          <w:bCs/>
-        </w:rPr>
-        <w:t>Slide 1 – Title (2 minutes)</w:t>
-      </w:r>
-    </w:p>
-    <w:p>
-      <w:r>
-        <w:t>“Let me start with a simple statement.</w:t>
+      <w:r>
+        <w:t xml:space="preserve">Hello everyone, </w:t>
+      </w:r>
+      <w:proofErr w:type="gramStart"/>
+      <w:r>
+        <w:t>Good</w:t>
+      </w:r>
+      <w:proofErr w:type="gramEnd"/>
+      <w:r>
+        <w:t xml:space="preserve"> afternoon!</w:t>
+      </w:r>
+    </w:p>
+    <w:p>
+      <w:r>
+        <w:t>Today I am presenting here the solution for a common issue with respect to use of AI.</w:t>
+      </w:r>
+      <w:r>
+        <w:br/>
+      </w:r>
+      <w:r>
+        <w:br/>
+        <w:t>We all use AI in our daily life, especially in our work for documentation creation.</w:t>
       </w:r>
     </w:p>
     <w:p>
@@ -35,36 +40,36 @@
       </w:r>
       <w:r>
         <w:br/>
-        <w:t>But documentation is not about sounding right… it’s about being right. (pause)</w:t>
-      </w:r>
-    </w:p>
-    <w:p>
-      <w:r>
-        <w:t>And that gap… is where things start to break.</w:t>
-      </w:r>
-    </w:p>
-    <w:p>
-      <w:r>
-        <w:t>Because if documentation is wrong, even slightly…</w:t>
-      </w:r>
-      <w:r>
-        <w:br/>
-        <w:t>it doesn’t just confuse people.</w:t>
-      </w:r>
-      <w:r>
-        <w:br/>
-        <w:t>It creates real problems. Support issues. Wrong configurations. Lost trust.</w:t>
-      </w:r>
-    </w:p>
-    <w:p>
-      <w:r>
-        <w:t>And the uncomfortable part is…</w:t>
-      </w:r>
-      <w:r>
-        <w:br/>
-        <w:t>most of the time, it still looks correct.</w:t>
-      </w:r>
-    </w:p>
+      </w:r>
+      <w:r>
+        <w:t>But technical documentation is not about sounding right… It causes real problems.</w:t>
+      </w:r>
+    </w:p>
+    <w:p>
+      <w:r>
+        <w:t xml:space="preserve">Wrong workflows, wrong processes, feedback from end users, and </w:t>
+      </w:r>
+      <w:proofErr w:type="gramStart"/>
+      <w:r>
+        <w:t>people</w:t>
+      </w:r>
+      <w:proofErr w:type="gramEnd"/>
+      <w:r>
+        <w:t xml:space="preserve"> stop trusting </w:t>
+      </w:r>
+      <w:r>
+        <w:t>us</w:t>
+      </w:r>
+      <w:r>
+        <w:t>.</w:t>
+      </w:r>
+    </w:p>
+    <w:p>
+      <w:r>
+        <w:t>The worst part is… most of the time, it still looks perfectly fine.</w:t>
+      </w:r>
+    </w:p>
+    <w:p/>
     <w:p>
       <w:r>
         <w:t>That’s exactly the problem we’re solving here.”</w:t>
@@ -72,16 +77,19 @@
     </w:p>
     <w:p>
       <w:r>
-        <w:t>(pause, look at audience)</w:t>
-      </w:r>
-    </w:p>
-    <w:p>
-      <w:r>
-        <w:t>“Because today, the challenge is not writing faster.</w:t>
-      </w:r>
-      <w:r>
-        <w:br/>
-        <w:t>It’s making sure what we write is actually true.”</w:t>
+        <w:t>Because the challenge is not writing faster.</w:t>
+      </w:r>
+      <w:r>
+        <w:br/>
+        <w:t xml:space="preserve">It’s making sure what we write is </w:t>
+      </w:r>
+      <w:proofErr w:type="gramStart"/>
+      <w:r>
+        <w:t>actually true</w:t>
+      </w:r>
+      <w:proofErr w:type="gramEnd"/>
+      <w:r>
+        <w:t>.</w:t>
       </w:r>
     </w:p>
     <w:p>
@@ -108,17 +116,13 @@
     </w:p>
     <w:p>
       <w:r>
-        <w:t>“Let me quickly walk you through what we’ll cover.</w:t>
+        <w:t>Let me quickly walk you through what we’ll cover.</w:t>
       </w:r>
     </w:p>
     <w:p>
       <w:r>
         <w:t>First, the real risk of using AI in documentation.</w:t>
       </w:r>
-      <w:r>
-        <w:br/>
-        <w:t>Not the obvious benefits… the hidden risks.</w:t>
-      </w:r>
     </w:p>
     <w:p>
       <w:r>
@@ -126,11 +130,28 @@
       </w:r>
       <w:proofErr w:type="gramStart"/>
       <w:r>
-        <w:t>this hits</w:t>
+        <w:t>this</w:t>
       </w:r>
       <w:proofErr w:type="gramEnd"/>
       <w:r>
-        <w:t xml:space="preserve"> us, as technical writers, harder than other roles.</w:t>
+        <w:t xml:space="preserve"> </w:t>
+      </w:r>
+      <w:r>
+        <w:t xml:space="preserve">affects </w:t>
+      </w:r>
+      <w:r>
+        <w:t xml:space="preserve">us, as technical writers, </w:t>
+      </w:r>
+      <w:proofErr w:type="gramStart"/>
+      <w:r>
+        <w:t>than</w:t>
+      </w:r>
+      <w:proofErr w:type="gramEnd"/>
+      <w:r>
+        <w:t xml:space="preserve"> any</w:t>
+      </w:r>
+      <w:r>
+        <w:t xml:space="preserve"> other roles.</w:t>
       </w:r>
     </w:p>
     <w:p>
@@ -180,31 +201,44 @@
     </w:p>
     <w:p>
       <w:r>
-        <w:t>“Let’s get straight to the problem.</w:t>
-      </w:r>
-    </w:p>
+        <w:t>Let’s get straight to the problem.</w:t>
+      </w:r>
+    </w:p>
+    <w:p>
+      <w:r>
+        <w:t xml:space="preserve">We all know </w:t>
+      </w:r>
+      <w:r>
+        <w:t>AI is fluent</w:t>
+      </w:r>
+      <w:r>
+        <w:t xml:space="preserve"> and better </w:t>
+      </w:r>
+      <w:r>
+        <w:t>in terms of phrasing</w:t>
+      </w:r>
+      <w:r>
+        <w:t xml:space="preserve"> the content</w:t>
+      </w:r>
+      <w:r>
+        <w:t>.</w:t>
+      </w:r>
+    </w:p>
+    <w:p>
+      <w:r>
+        <w:t xml:space="preserve">But </w:t>
+      </w:r>
+      <w:r>
+        <w:t xml:space="preserve">technical </w:t>
+      </w:r>
+      <w:r>
+        <w:t>documentation needs to be correct. Not just fluent.</w:t>
+      </w:r>
+    </w:p>
+    <w:p/>
     <w:p>
       <w:r>
         <w:lastRenderedPageBreak/>
-        <w:t>AI is fluent. Very fluent.</w:t>
-      </w:r>
-      <w:r>
-        <w:br/>
-        <w:t>Sometimes better than us in terms of phrasing.</w:t>
-      </w:r>
-    </w:p>
-    <w:p>
-      <w:r>
-        <w:t>But documentation needs to be correct. Not just fluent.</w:t>
-      </w:r>
-    </w:p>
-    <w:p>
-      <w:r>
-        <w:t>And those two are not the same. (pause)</w:t>
-      </w:r>
-    </w:p>
-    <w:p>
-      <w:r>
         <w:t xml:space="preserve">Here’s what </w:t>
       </w:r>
       <w:proofErr w:type="gramStart"/>
@@ -218,16 +252,45 @@
     </w:p>
     <w:p>
       <w:r>
-        <w:t>You give AI incomplete input.</w:t>
-      </w:r>
-      <w:r>
-        <w:br/>
-        <w:t>Which is normal, because source content is never perfect.</w:t>
-      </w:r>
-    </w:p>
-    <w:p>
-      <w:r>
-        <w:t>Now instead of stopping…</w:t>
+        <w:t>When you</w:t>
+      </w:r>
+      <w:r>
+        <w:t xml:space="preserve"> give incomplete input</w:t>
+      </w:r>
+      <w:r>
+        <w:t xml:space="preserve"> to </w:t>
+      </w:r>
+      <w:r>
+        <w:t>AI</w:t>
+      </w:r>
+      <w:r>
+        <w:br/>
+        <w:t>Which is normal</w:t>
+      </w:r>
+      <w:r>
+        <w:t xml:space="preserve"> right</w:t>
+      </w:r>
+      <w:r>
+        <w:t xml:space="preserve">, because source content </w:t>
+      </w:r>
+      <w:r>
+        <w:t xml:space="preserve">we receive </w:t>
+      </w:r>
+      <w:r>
+        <w:t>is never perfect.</w:t>
+      </w:r>
+    </w:p>
+    <w:p>
+      <w:proofErr w:type="gramStart"/>
+      <w:r>
+        <w:t>So</w:t>
+      </w:r>
+      <w:proofErr w:type="gramEnd"/>
+      <w:r>
+        <w:t xml:space="preserve"> what AI do, </w:t>
+      </w:r>
+      <w:r>
+        <w:t>instead of stopping…</w:t>
       </w:r>
       <w:r>
         <w:br/>
@@ -249,53 +312,18 @@
     </w:p>
     <w:p>
       <w:r>
-        <w:t>And the worst one… it assumes workflows.</w:t>
+        <w:t xml:space="preserve">And </w:t>
+      </w:r>
+      <w:r>
+        <w:t xml:space="preserve">sometimes </w:t>
+      </w:r>
+      <w:r>
+        <w:t>it assumes workflows.</w:t>
       </w:r>
     </w:p>
     <w:p>
       <w:r>
         <w:t>Let me give you a simple example.</w:t>
-      </w:r>
-    </w:p>
-    <w:p>
-      <w:r>
-        <w:t>You write:</w:t>
-      </w:r>
-      <w:r>
-        <w:br/>
-        <w:t>‘Configure connection settings.’</w:t>
-      </w:r>
-    </w:p>
-    <w:p>
-      <w:r>
-        <w:t>AI might expand that into</w:t>
-      </w:r>
-      <w:r>
-        <w:br/>
-        <w:t>timeouts, retries, validations… everything.</w:t>
-      </w:r>
-    </w:p>
-    <w:p>
-      <w:r>
-        <w:t>Looks great.</w:t>
-      </w:r>
-      <w:r>
-        <w:br/>
-        <w:t>But maybe none of that exists in the product.</w:t>
-      </w:r>
-    </w:p>
-    <w:p>
-      <w:r>
-        <w:t>Now your documentation is wrong…</w:t>
-      </w:r>
-      <w:r>
-        <w:br/>
-        <w:t>but it looks professional.</w:t>
-      </w:r>
-    </w:p>
-    <w:p>
-      <w:r>
-        <w:t>That’s the dangerous part.”</w:t>
       </w:r>
     </w:p>
     <w:p>
@@ -322,27 +350,25 @@
     </w:p>
     <w:p>
       <w:r>
-        <w:t>“Now here’s where it becomes a real problem.</w:t>
-      </w:r>
-    </w:p>
-    <w:p>
-      <w:r>
         <w:t>When documentation is wrong… nobody blames the AI. (pause)</w:t>
       </w:r>
     </w:p>
     <w:p>
       <w:r>
-        <w:t>Think about your review process.</w:t>
-      </w:r>
-    </w:p>
-    <w:p>
-      <w:r>
-        <w:lastRenderedPageBreak/>
-        <w:t>Reviewers only see the final content.</w:t>
-      </w:r>
-      <w:r>
-        <w:br/>
-        <w:t>They don’t see the prompt.</w:t>
+        <w:t>End users</w:t>
+      </w:r>
+      <w:r>
+        <w:t xml:space="preserve"> only see the final content.</w:t>
+      </w:r>
+      <w:r>
+        <w:br/>
+        <w:t>They don’t see the prompt</w:t>
+      </w:r>
+      <w:r>
+        <w:t xml:space="preserve"> we used</w:t>
+      </w:r>
+      <w:r>
+        <w:t>.</w:t>
       </w:r>
       <w:r>
         <w:br/>
@@ -378,31 +404,29 @@
     </w:p>
     <w:p>
       <w:r>
-        <w:t>And that means… the responsibility falls on the writer.</w:t>
-      </w:r>
-    </w:p>
-    <w:p>
-      <w:r>
-        <w:t>So yes, AI makes us faster.</w:t>
-      </w:r>
-    </w:p>
-    <w:p>
-      <w:r>
-        <w:t>But accountability has not changed at all.</w:t>
-      </w:r>
-    </w:p>
-    <w:p>
-      <w:r>
-        <w:t>And that creates a mismatch.</w:t>
-      </w:r>
-    </w:p>
-    <w:p>
-      <w:r>
-        <w:t>We are moving faster…</w:t>
-      </w:r>
-      <w:r>
-        <w:br/>
-        <w:t>but we are also taking on more invisible risk.”</w:t>
+        <w:t xml:space="preserve">And that means… the responsibility falls on the </w:t>
+      </w:r>
+      <w:r>
+        <w:t xml:space="preserve">technical </w:t>
+      </w:r>
+      <w:r>
+        <w:t>writer.</w:t>
+      </w:r>
+    </w:p>
+    <w:p>
+      <w:r>
+        <w:t>So, AI makes us faster.</w:t>
+      </w:r>
+    </w:p>
+    <w:p>
+      <w:r>
+        <w:t xml:space="preserve">But </w:t>
+      </w:r>
+      <w:r>
+        <w:t>responsibility</w:t>
+      </w:r>
+      <w:r>
+        <w:t xml:space="preserve"> has not changed at all.</w:t>
       </w:r>
     </w:p>
     <w:p>
@@ -429,44 +453,60 @@
     </w:p>
     <w:p>
       <w:r>
-        <w:t>“This is the core mismatch.</w:t>
+        <w:t>Why existing AI tools don’t solve this</w:t>
+      </w:r>
+      <w:r>
+        <w:t>.</w:t>
       </w:r>
     </w:p>
     <w:p>
       <w:r>
         <w:t>AI is designed to solve ambiguity.</w:t>
       </w:r>
-      <w:r>
-        <w:br/>
-        <w:t>Documentation is designed to expose it.</w:t>
-      </w:r>
-    </w:p>
-    <w:p>
-      <w:r>
-        <w:t>AI sees missing information and thinks:</w:t>
-      </w:r>
-      <w:r>
-        <w:br/>
-        <w:t>‘Let me fix this.’</w:t>
-      </w:r>
-    </w:p>
-    <w:p>
-      <w:r>
-        <w:t>But in documentation…</w:t>
-      </w:r>
-    </w:p>
-    <w:p>
-      <w:r>
-        <w:t>Missing information is a signal.</w:t>
-      </w:r>
-      <w:r>
-        <w:br/>
-        <w:t>It tells us something is incomplete.</w:t>
-      </w:r>
-    </w:p>
-    <w:p>
+    </w:p>
+    <w:p>
+      <w:r>
+        <w:t xml:space="preserve">When </w:t>
+      </w:r>
+      <w:r>
+        <w:t xml:space="preserve">AI </w:t>
+      </w:r>
       <w:proofErr w:type="gramStart"/>
       <w:r>
+        <w:t>get</w:t>
+      </w:r>
+      <w:proofErr w:type="gramEnd"/>
+      <w:r>
+        <w:t xml:space="preserve"> some missing</w:t>
+      </w:r>
+      <w:r>
+        <w:t xml:space="preserve"> information</w:t>
+      </w:r>
+      <w:r>
+        <w:t>, it starts to fix it.</w:t>
+      </w:r>
+    </w:p>
+    <w:p>
+      <w:r>
+        <w:t xml:space="preserve">But in </w:t>
+      </w:r>
+      <w:r>
+        <w:t xml:space="preserve">technical </w:t>
+      </w:r>
+      <w:r>
+        <w:t>documentati</w:t>
+      </w:r>
+      <w:r>
+        <w:t>on, m</w:t>
+      </w:r>
+      <w:r>
+        <w:t>issing information tells us something is incomplete.</w:t>
+      </w:r>
+    </w:p>
+    <w:p>
+      <w:proofErr w:type="gramStart"/>
+      <w:r>
+        <w:lastRenderedPageBreak/>
         <w:t>So</w:t>
       </w:r>
       <w:proofErr w:type="gramEnd"/>
@@ -476,15 +516,20 @@
     </w:p>
     <w:p>
       <w:r>
-        <w:t>We should stop.</w:t>
-      </w:r>
-      <w:r>
-        <w:br/>
-        <w:t>We should question.</w:t>
-      </w:r>
-      <w:r>
-        <w:br/>
-        <w:t>We should clarify.</w:t>
+        <w:t>We should stop</w:t>
+      </w:r>
+      <w:r>
+        <w:t xml:space="preserve"> and ask</w:t>
+      </w:r>
+      <w:r>
+        <w:t xml:space="preserve"> question.</w:t>
+      </w:r>
+      <w:r>
+        <w:br/>
+        <w:t>We should clarify</w:t>
+      </w:r>
+      <w:r>
+        <w:t xml:space="preserve"> before proceeding.</w:t>
       </w:r>
     </w:p>
     <w:p>
@@ -494,17 +539,18 @@
     </w:p>
     <w:p>
       <w:r>
-        <w:t>It continues. It fills. It hides the gap.</w:t>
-      </w:r>
-    </w:p>
-    <w:p>
-      <w:r>
-        <w:lastRenderedPageBreak/>
+        <w:t>It continues</w:t>
+      </w:r>
+      <w:r>
+        <w:t xml:space="preserve"> and fills</w:t>
+      </w:r>
+      <w:r>
+        <w:t xml:space="preserve"> the gap.</w:t>
+      </w:r>
+    </w:p>
+    <w:p>
+      <w:r>
         <w:t>And that’s why existing tools don’t solve this problem.</w:t>
-      </w:r>
-      <w:r>
-        <w:br/>
-        <w:t>Because they are built to generate… not to govern.”</w:t>
       </w:r>
     </w:p>
     <w:p>
@@ -531,25 +577,38 @@
     </w:p>
     <w:p>
       <w:r>
-        <w:t>“So instead of trying to make AI smarter…</w:t>
-      </w:r>
-    </w:p>
-    <w:p>
-      <w:r>
-        <w:t xml:space="preserve">We </w:t>
+        <w:t>“</w:t>
       </w:r>
       <w:proofErr w:type="gramStart"/>
       <w:r>
-        <w:t>change</w:t>
+        <w:t>So</w:t>
       </w:r>
       <w:proofErr w:type="gramEnd"/>
       <w:r>
-        <w:t xml:space="preserve"> the rules. (pause)</w:t>
-      </w:r>
-    </w:p>
-    <w:p>
-      <w:r>
-        <w:t>We control when AI is allowed to act.</w:t>
+        <w:t xml:space="preserve"> </w:t>
+      </w:r>
+      <w:r>
+        <w:t>the</w:t>
+      </w:r>
+      <w:r>
+        <w:t xml:space="preserve"> idea is </w:t>
+      </w:r>
+      <w:r>
+        <w:t>instead of trying to make AI smarte</w:t>
+      </w:r>
+      <w:r>
+        <w:t>r w</w:t>
+      </w:r>
+      <w:r>
+        <w:t xml:space="preserve">e change the rules. </w:t>
+      </w:r>
+    </w:p>
+    <w:p>
+      <w:r>
+        <w:t>Which means, w</w:t>
+      </w:r>
+      <w:r>
+        <w:t>e control when AI is allowed to act.</w:t>
       </w:r>
     </w:p>
     <w:p>
@@ -559,48 +618,40 @@
     </w:p>
     <w:p>
       <w:r>
-        <w:t>Before anything is generated…</w:t>
-      </w:r>
-      <w:r>
-        <w:br/>
-        <w:t>we force a gap analysis.</w:t>
-      </w:r>
-    </w:p>
-    <w:p>
-      <w:r>
-        <w:t>We identify what is missing.</w:t>
-      </w:r>
-      <w:r>
-        <w:br/>
-        <w:t>We resolve what we can.</w:t>
-      </w:r>
-      <w:r>
-        <w:br/>
-        <w:t>And we explicitly track what is unknown.</w:t>
-      </w:r>
-    </w:p>
-    <w:p>
-      <w:proofErr w:type="gramStart"/>
-      <w:r>
-        <w:t>So</w:t>
-      </w:r>
-      <w:proofErr w:type="gramEnd"/>
-      <w:r>
-        <w:t xml:space="preserve"> we move away from creative interpretation…</w:t>
-      </w:r>
-      <w:r>
-        <w:br/>
-        <w:t>and toward accountability.</w:t>
-      </w:r>
-    </w:p>
-    <w:p>
-      <w:r>
-        <w:t>And the result is simple.</w:t>
-      </w:r>
-    </w:p>
-    <w:p>
-      <w:r>
-        <w:t>Documentation that you can defend.”</w:t>
+        <w:t>Before anything is generated</w:t>
+      </w:r>
+      <w:r>
+        <w:t xml:space="preserve"> by AI </w:t>
+      </w:r>
+      <w:r>
+        <w:t>we</w:t>
+      </w:r>
+      <w:r>
+        <w:t xml:space="preserve"> do</w:t>
+      </w:r>
+      <w:r>
+        <w:t xml:space="preserve"> a gap analysis.</w:t>
+      </w:r>
+    </w:p>
+    <w:p>
+      <w:r>
+        <w:t>We identify what is missing</w:t>
+      </w:r>
+      <w:r>
+        <w:t xml:space="preserve"> and </w:t>
+      </w:r>
+      <w:r>
+        <w:t>resolve what we can.</w:t>
+      </w:r>
+      <w:r>
+        <w:br/>
+        <w:t>A</w:t>
+      </w:r>
+      <w:r>
+        <w:t>lso</w:t>
+      </w:r>
+      <w:r>
+        <w:t xml:space="preserve"> we track what is unknown.</w:t>
       </w:r>
     </w:p>
     <w:p>
@@ -627,6 +678,11 @@
     </w:p>
     <w:p>
       <w:r>
+        <w:t>This is basically a web application.</w:t>
+      </w:r>
+    </w:p>
+    <w:p>
+      <w:r>
         <w:t>“Let’s look at how this works.</w:t>
       </w:r>
     </w:p>
@@ -670,12 +726,12 @@
     </w:p>
     <w:p>
       <w:r>
+        <w:t>This is where the system forces you to think.</w:t>
+      </w:r>
+    </w:p>
+    <w:p>
+      <w:r>
         <w:lastRenderedPageBreak/>
-        <w:t>This is where the system forces you to think.</w:t>
-      </w:r>
-    </w:p>
-    <w:p>
-      <w:r>
         <w:t>What is missing?</w:t>
       </w:r>
       <w:r>
@@ -811,16 +867,34 @@
     <w:p>
       <w:pPr>
         <w:rPr>
-          <w:b/>
-          <w:bCs/>
-        </w:rPr>
-      </w:pPr>
-      <w:r>
-        <w:rPr>
           <w:rFonts w:ascii="Segoe UI Emoji" w:hAnsi="Segoe UI Emoji" w:cs="Segoe UI Emoji"/>
           <w:b/>
           <w:bCs/>
         </w:rPr>
+      </w:pPr>
+    </w:p>
+    <w:p>
+      <w:pPr>
+        <w:rPr>
+          <w:rFonts w:ascii="Segoe UI Emoji" w:hAnsi="Segoe UI Emoji" w:cs="Segoe UI Emoji"/>
+          <w:b/>
+          <w:bCs/>
+        </w:rPr>
+      </w:pPr>
+    </w:p>
+    <w:p>
+      <w:pPr>
+        <w:rPr>
+          <w:b/>
+          <w:bCs/>
+        </w:rPr>
+      </w:pPr>
+      <w:r>
+        <w:rPr>
+          <w:rFonts w:ascii="Segoe UI Emoji" w:hAnsi="Segoe UI Emoji" w:cs="Segoe UI Emoji"/>
+          <w:b/>
+          <w:bCs/>
+        </w:rPr>
         <w:t>🎯</w:t>
       </w:r>
       <w:r>
@@ -844,139 +918,9 @@
           <w:bCs/>
         </w:rPr>
         <w:lastRenderedPageBreak/>
-        <w:t>Your goal is simple:</w:t>
-      </w:r>
-      <w:r>
-        <w:rPr>
-          <w:b/>
-          <w:bCs/>
-        </w:rPr>
-        <w:br/>
-      </w:r>
-      <w:r>
-        <w:rPr>
-          <w:rFonts w:ascii="Segoe UI Emoji" w:hAnsi="Segoe UI Emoji" w:cs="Segoe UI Emoji"/>
-          <w:b/>
-          <w:bCs/>
-        </w:rPr>
-        <w:t>👉</w:t>
-      </w:r>
-      <w:r>
-        <w:rPr>
-          <w:b/>
-          <w:bCs/>
-        </w:rPr>
-        <w:t xml:space="preserve"> Prove that AI is controlled, not creative</w:t>
-      </w:r>
-    </w:p>
-    <w:p>
-      <w:pPr>
-        <w:rPr>
-          <w:b/>
-          <w:bCs/>
-        </w:rPr>
-      </w:pPr>
-      <w:r>
-        <w:rPr>
-          <w:b/>
-          <w:bCs/>
-        </w:rPr>
-        <w:pict w14:anchorId="162A438A">
-          <v:rect id="_x0000_i1085" style="width:0;height:1.5pt" o:hralign="center" o:hrstd="t" o:hr="t" fillcolor="#a0a0a0" stroked="f"/>
+        <w:pict w14:anchorId="6E6DC4E5">
+          <v:rect id="_x0000_i1049" style="width:0;height:1.5pt" o:hralign="center" o:hrstd="t" o:hr="t" fillcolor="#a0a0a0" stroked="f"/>
         </w:pict>
-      </w:r>
-    </w:p>
-    <w:p>
-      <w:pPr>
-        <w:rPr>
-          <w:b/>
-          <w:bCs/>
-        </w:rPr>
-      </w:pPr>
-      <w:r>
-        <w:rPr>
-          <w:rFonts w:ascii="Segoe UI Emoji" w:hAnsi="Segoe UI Emoji" w:cs="Segoe UI Emoji"/>
-          <w:b/>
-          <w:bCs/>
-        </w:rPr>
-        <w:t>🧠</w:t>
-      </w:r>
-      <w:r>
-        <w:rPr>
-          <w:b/>
-          <w:bCs/>
-        </w:rPr>
-        <w:t xml:space="preserve"> Demo Script (5–6 minutes)</w:t>
-      </w:r>
-    </w:p>
-    <w:p>
-      <w:pPr>
-        <w:rPr>
-          <w:b/>
-          <w:bCs/>
-        </w:rPr>
-      </w:pPr>
-      <w:r>
-        <w:rPr>
-          <w:b/>
-          <w:bCs/>
-        </w:rPr>
-        <w:t>Transition from Slide to Demo</w:t>
-      </w:r>
-    </w:p>
-    <w:p>
-      <w:pPr>
-        <w:rPr>
-          <w:b/>
-          <w:bCs/>
-        </w:rPr>
-      </w:pPr>
-      <w:r>
-        <w:rPr>
-          <w:b/>
-          <w:bCs/>
-        </w:rPr>
-        <w:t>“Now instead of just explaining this…</w:t>
-      </w:r>
-      <w:r>
-        <w:rPr>
-          <w:b/>
-          <w:bCs/>
-        </w:rPr>
-        <w:br/>
-        <w:t>let me show you what actually happens.” (pause)</w:t>
-      </w:r>
-    </w:p>
-    <w:p>
-      <w:pPr>
-        <w:rPr>
-          <w:b/>
-          <w:bCs/>
-        </w:rPr>
-      </w:pPr>
-      <w:r>
-        <w:rPr>
-          <w:b/>
-          <w:bCs/>
-        </w:rPr>
-        <w:pict w14:anchorId="6E6DC4E5">
-          <v:rect id="_x0000_i1086" style="width:0;height:1.5pt" o:hralign="center" o:hrstd="t" o:hr="t" fillcolor="#a0a0a0" stroked="f"/>
-        </w:pict>
-      </w:r>
-    </w:p>
-    <w:p>
-      <w:pPr>
-        <w:rPr>
-          <w:b/>
-          <w:bCs/>
-        </w:rPr>
-      </w:pPr>
-      <w:r>
-        <w:rPr>
-          <w:b/>
-          <w:bCs/>
-        </w:rPr>
-        <w:t>Step 1 – Show messy source (Image 1)</w:t>
       </w:r>
     </w:p>
     <w:p>
@@ -1164,7 +1108,7 @@
           <w:bCs/>
         </w:rPr>
         <w:pict w14:anchorId="04277523">
-          <v:rect id="_x0000_i1087" style="width:0;height:1.5pt" o:hralign="center" o:hrstd="t" o:hr="t" fillcolor="#a0a0a0" stroked="f"/>
+          <v:rect id="_x0000_i1036" style="width:0;height:1.5pt" o:hralign="center" o:hrstd="t" o:hr="t" fillcolor="#a0a0a0" stroked="f"/>
         </w:pict>
       </w:r>
     </w:p>
@@ -1279,138 +1223,138 @@
           <w:b/>
           <w:bCs/>
         </w:rPr>
+        <w:t>👉</w:t>
+      </w:r>
+      <w:r>
+        <w:rPr>
+          <w:b/>
+          <w:bCs/>
+        </w:rPr>
+        <w:t xml:space="preserve"> Emphasize:</w:t>
+      </w:r>
+      <w:r>
+        <w:rPr>
+          <w:b/>
+          <w:bCs/>
+        </w:rPr>
+        <w:br/>
+        <w:t>“This is important</w:t>
+      </w:r>
+      <w:proofErr w:type="gramStart"/>
+      <w:r>
+        <w:rPr>
+          <w:b/>
+          <w:bCs/>
+        </w:rPr>
+        <w:t>.</w:t>
+      </w:r>
+      <w:proofErr w:type="gramEnd"/>
+      <w:r>
+        <w:rPr>
+          <w:b/>
+          <w:bCs/>
+        </w:rPr>
+        <w:t xml:space="preserve"> We are not asking AI to think yet.”</w:t>
+      </w:r>
+    </w:p>
+    <w:p>
+      <w:pPr>
+        <w:rPr>
+          <w:b/>
+          <w:bCs/>
+        </w:rPr>
+      </w:pPr>
+      <w:r>
+        <w:rPr>
+          <w:b/>
+          <w:bCs/>
+        </w:rPr>
+        <w:pict w14:anchorId="78C58193">
+          <v:rect id="_x0000_i1037" style="width:0;height:1.5pt" o:hralign="center" o:hrstd="t" o:hr="t" fillcolor="#a0a0a0" stroked="f"/>
+        </w:pict>
+      </w:r>
+    </w:p>
+    <w:p>
+      <w:pPr>
+        <w:rPr>
+          <w:b/>
+          <w:bCs/>
+        </w:rPr>
+      </w:pPr>
+      <w:r>
+        <w:rPr>
+          <w:b/>
+          <w:bCs/>
+        </w:rPr>
+        <w:t>Step 3 – Clarification mindset (talk, not UI heavy)</w:t>
+      </w:r>
+    </w:p>
+    <w:p>
+      <w:pPr>
+        <w:rPr>
+          <w:b/>
+          <w:bCs/>
+        </w:rPr>
+      </w:pPr>
+      <w:r>
+        <w:rPr>
+          <w:b/>
+          <w:bCs/>
+        </w:rPr>
+        <w:t>“Now comes the key step.</w:t>
+      </w:r>
+    </w:p>
+    <w:p>
+      <w:pPr>
+        <w:rPr>
+          <w:b/>
+          <w:bCs/>
+        </w:rPr>
+      </w:pPr>
+      <w:r>
+        <w:rPr>
+          <w:b/>
+          <w:bCs/>
+        </w:rPr>
+        <w:t>Gap analysis.</w:t>
+      </w:r>
+    </w:p>
+    <w:p>
+      <w:pPr>
+        <w:rPr>
+          <w:b/>
+          <w:bCs/>
+        </w:rPr>
+      </w:pPr>
+      <w:r>
+        <w:rPr>
+          <w:b/>
+          <w:bCs/>
+        </w:rPr>
+        <w:t>Instead of letting AI guess…</w:t>
+      </w:r>
+      <w:r>
+        <w:rPr>
+          <w:b/>
+          <w:bCs/>
+        </w:rPr>
+        <w:br/>
+        <w:t>we force ourselves to answer what’s missing.”</w:t>
+      </w:r>
+    </w:p>
+    <w:p>
+      <w:pPr>
+        <w:rPr>
+          <w:b/>
+          <w:bCs/>
+        </w:rPr>
+      </w:pPr>
+      <w:r>
+        <w:rPr>
+          <w:b/>
+          <w:bCs/>
+        </w:rPr>
         <w:lastRenderedPageBreak/>
-        <w:t>👉</w:t>
-      </w:r>
-      <w:r>
-        <w:rPr>
-          <w:b/>
-          <w:bCs/>
-        </w:rPr>
-        <w:t xml:space="preserve"> Emphasize:</w:t>
-      </w:r>
-      <w:r>
-        <w:rPr>
-          <w:b/>
-          <w:bCs/>
-        </w:rPr>
-        <w:br/>
-        <w:t>“This is important</w:t>
-      </w:r>
-      <w:proofErr w:type="gramStart"/>
-      <w:r>
-        <w:rPr>
-          <w:b/>
-          <w:bCs/>
-        </w:rPr>
-        <w:t>.</w:t>
-      </w:r>
-      <w:proofErr w:type="gramEnd"/>
-      <w:r>
-        <w:rPr>
-          <w:b/>
-          <w:bCs/>
-        </w:rPr>
-        <w:t xml:space="preserve"> We are not asking AI to think yet.”</w:t>
-      </w:r>
-    </w:p>
-    <w:p>
-      <w:pPr>
-        <w:rPr>
-          <w:b/>
-          <w:bCs/>
-        </w:rPr>
-      </w:pPr>
-      <w:r>
-        <w:rPr>
-          <w:b/>
-          <w:bCs/>
-        </w:rPr>
-        <w:pict w14:anchorId="78C58193">
-          <v:rect id="_x0000_i1088" style="width:0;height:1.5pt" o:hralign="center" o:hrstd="t" o:hr="t" fillcolor="#a0a0a0" stroked="f"/>
-        </w:pict>
-      </w:r>
-    </w:p>
-    <w:p>
-      <w:pPr>
-        <w:rPr>
-          <w:b/>
-          <w:bCs/>
-        </w:rPr>
-      </w:pPr>
-      <w:r>
-        <w:rPr>
-          <w:b/>
-          <w:bCs/>
-        </w:rPr>
-        <w:t>Step 3 – Clarification mindset (talk, not UI heavy)</w:t>
-      </w:r>
-    </w:p>
-    <w:p>
-      <w:pPr>
-        <w:rPr>
-          <w:b/>
-          <w:bCs/>
-        </w:rPr>
-      </w:pPr>
-      <w:r>
-        <w:rPr>
-          <w:b/>
-          <w:bCs/>
-        </w:rPr>
-        <w:t>“Now comes the key step.</w:t>
-      </w:r>
-    </w:p>
-    <w:p>
-      <w:pPr>
-        <w:rPr>
-          <w:b/>
-          <w:bCs/>
-        </w:rPr>
-      </w:pPr>
-      <w:r>
-        <w:rPr>
-          <w:b/>
-          <w:bCs/>
-        </w:rPr>
-        <w:t>Gap analysis.</w:t>
-      </w:r>
-    </w:p>
-    <w:p>
-      <w:pPr>
-        <w:rPr>
-          <w:b/>
-          <w:bCs/>
-        </w:rPr>
-      </w:pPr>
-      <w:r>
-        <w:rPr>
-          <w:b/>
-          <w:bCs/>
-        </w:rPr>
-        <w:t>Instead of letting AI guess…</w:t>
-      </w:r>
-      <w:r>
-        <w:rPr>
-          <w:b/>
-          <w:bCs/>
-        </w:rPr>
-        <w:br/>
-        <w:t>we force ourselves to answer what’s missing.”</w:t>
-      </w:r>
-    </w:p>
-    <w:p>
-      <w:pPr>
-        <w:rPr>
-          <w:b/>
-          <w:bCs/>
-        </w:rPr>
-      </w:pPr>
-      <w:r>
-        <w:rPr>
-          <w:b/>
-          <w:bCs/>
-        </w:rPr>
         <w:t>(pause)</w:t>
       </w:r>
     </w:p>
@@ -1450,7 +1394,7 @@
           <w:bCs/>
         </w:rPr>
         <w:pict w14:anchorId="4C08D7A4">
-          <v:rect id="_x0000_i1089" style="width:0;height:1.5pt" o:hralign="center" o:hrstd="t" o:hr="t" fillcolor="#a0a0a0" stroked="f"/>
+          <v:rect id="_x0000_i1038" style="width:0;height:1.5pt" o:hralign="center" o:hrstd="t" o:hr="t" fillcolor="#a0a0a0" stroked="f"/>
         </w:pict>
       </w:r>
     </w:p>
@@ -1683,7 +1627,7 @@
           <w:bCs/>
         </w:rPr>
         <w:pict w14:anchorId="0A459682">
-          <v:rect id="_x0000_i1090" style="width:0;height:1.5pt" o:hralign="center" o:hrstd="t" o:hr="t" fillcolor="#a0a0a0" stroked="f"/>
+          <v:rect id="_x0000_i1039" style="width:0;height:1.5pt" o:hralign="center" o:hrstd="t" o:hr="t" fillcolor="#a0a0a0" stroked="f"/>
         </w:pict>
       </w:r>
     </w:p>
@@ -1699,7 +1643,6 @@
           <w:b/>
           <w:bCs/>
         </w:rPr>
-        <w:lastRenderedPageBreak/>
         <w:t>Step 5 – AI output (Image 3)</w:t>
       </w:r>
     </w:p>
@@ -1821,6 +1764,7 @@
           <w:b/>
           <w:bCs/>
         </w:rPr>
+        <w:lastRenderedPageBreak/>
         <w:t xml:space="preserve">No added explanations </w:t>
       </w:r>
     </w:p>
@@ -1887,7 +1831,7 @@
           <w:bCs/>
         </w:rPr>
         <w:pict w14:anchorId="2AABAA3B">
-          <v:rect id="_x0000_i1091" style="width:0;height:1.5pt" o:hralign="center" o:hrstd="t" o:hr="t" fillcolor="#a0a0a0" stroked="f"/>
+          <v:rect id="_x0000_i1040" style="width:0;height:1.5pt" o:hralign="center" o:hrstd="t" o:hr="t" fillcolor="#a0a0a0" stroked="f"/>
         </w:pict>
       </w:r>
     </w:p>
@@ -2056,7 +2000,7 @@
           <w:bCs/>
         </w:rPr>
         <w:pict w14:anchorId="16AE6B55">
-          <v:rect id="_x0000_i1092" style="width:0;height:1.5pt" o:hralign="center" o:hrstd="t" o:hr="t" fillcolor="#a0a0a0" stroked="f"/>
+          <v:rect id="_x0000_i1041" style="width:0;height:1.5pt" o:hralign="center" o:hrstd="t" o:hr="t" fillcolor="#a0a0a0" stroked="f"/>
         </w:pict>
       </w:r>
     </w:p>
@@ -2118,7 +2062,6 @@
           <w:b/>
           <w:bCs/>
         </w:rPr>
-        <w:lastRenderedPageBreak/>
         <w:t>We didn’t try to improve AI.</w:t>
       </w:r>
       <w:r>
@@ -2240,12 +2183,57 @@
         </w:rPr>
       </w:pPr>
       <w:r>
+        <w:lastRenderedPageBreak/>
+        <w:t>Look at this list</w:t>
+      </w:r>
+      <w:r>
+        <w:t xml:space="preserve"> of known gaps</w:t>
+      </w:r>
+      <w:r>
+        <w:t>. A standard AI would have just invented a fake log path or a fake menu for Step 8. Our app realized the source was missing these details, and instead of lying to you, it </w:t>
+      </w:r>
+      <w:r>
+        <w:rPr>
+          <w:b/>
+          <w:bCs/>
+        </w:rPr>
+        <w:t>exposed the weakness</w:t>
+      </w:r>
+      <w:r>
+        <w:t> in our original notes. This is the difference between an AI tool you can 'hope' is right and a Governance tool you </w:t>
+      </w:r>
+      <w:r>
+        <w:rPr>
+          <w:b/>
+          <w:bCs/>
+        </w:rPr>
+        <w:t>know</w:t>
+      </w:r>
+      <w:r>
+        <w:t> is honest</w:t>
+      </w:r>
+      <w:r>
+        <w:rPr>
+          <w:i/>
+          <w:iCs/>
+        </w:rPr>
+        <w:t>.</w:t>
+      </w:r>
+    </w:p>
+    <w:p>
+      <w:pPr>
+        <w:rPr>
+          <w:b/>
+          <w:bCs/>
+        </w:rPr>
+      </w:pPr>
+      <w:r>
         <w:rPr>
           <w:b/>
           <w:bCs/>
         </w:rPr>
         <w:pict w14:anchorId="72F31BE1">
-          <v:rect id="_x0000_i1101" style="width:0;height:1.5pt" o:hralign="center" o:hrstd="t" o:hr="t" fillcolor="#a0a0a0" stroked="f"/>
+          <v:rect id="_x0000_i1042" style="width:0;height:1.5pt" o:hralign="center" o:hrstd="t" o:hr="t" fillcolor="#a0a0a0" stroked="f"/>
         </w:pict>
       </w:r>
     </w:p>
@@ -2333,7 +2321,7 @@
     <w:p>
       <w:r>
         <w:pict w14:anchorId="28DAE3E0">
-          <v:rect id="_x0000_i1034" style="width:0;height:1.5pt" o:hralign="center" o:hrstd="t" o:hr="t" fillcolor="#a0a0a0" stroked="f"/>
+          <v:rect id="_x0000_i1043" style="width:0;height:1.5pt" o:hralign="center" o:hrstd="t" o:hr="t" fillcolor="#a0a0a0" stroked="f"/>
         </w:pict>
       </w:r>
     </w:p>
@@ -2373,32 +2361,32 @@
     </w:p>
     <w:p>
       <w:r>
+        <w:t>It makes AI predictable.</w:t>
+      </w:r>
+      <w:r>
+        <w:br/>
+        <w:t>Reviewable.</w:t>
+      </w:r>
+      <w:r>
+        <w:br/>
+        <w:t>Accountable.</w:t>
+      </w:r>
+    </w:p>
+    <w:p>
+      <w:r>
+        <w:t>It doesn’t make AI smarter…</w:t>
+      </w:r>
+    </w:p>
+    <w:p>
+      <w:r>
+        <w:t>It makes AI stop lying.” (pause)</w:t>
+      </w:r>
+    </w:p>
+    <w:p>
+      <w:r>
         <w:lastRenderedPageBreak/>
-        <w:t>It makes AI predictable.</w:t>
-      </w:r>
-      <w:r>
-        <w:br/>
-        <w:t>Reviewable.</w:t>
-      </w:r>
-      <w:r>
-        <w:br/>
-        <w:t>Accountable.</w:t>
-      </w:r>
-    </w:p>
-    <w:p>
-      <w:r>
-        <w:t>It doesn’t make AI smarter…</w:t>
-      </w:r>
-    </w:p>
-    <w:p>
-      <w:r>
-        <w:t>It makes AI stop lying.” (pause)</w:t>
-      </w:r>
-    </w:p>
-    <w:p>
-      <w:r>
         <w:pict w14:anchorId="7064D852">
-          <v:rect id="_x0000_i1035" style="width:0;height:1.5pt" o:hralign="center" o:hrstd="t" o:hr="t" fillcolor="#a0a0a0" stroked="f"/>
+          <v:rect id="_x0000_i1044" style="width:0;height:1.5pt" o:hralign="center" o:hrstd="t" o:hr="t" fillcolor="#a0a0a0" stroked="f"/>
         </w:pict>
       </w:r>
     </w:p>
@@ -2444,7 +2432,7 @@
     <w:p>
       <w:r>
         <w:pict w14:anchorId="67CBBAB9">
-          <v:rect id="_x0000_i1036" style="width:0;height:1.5pt" o:hralign="center" o:hrstd="t" o:hr="t" fillcolor="#a0a0a0" stroked="f"/>
+          <v:rect id="_x0000_i1045" style="width:0;height:1.5pt" o:hralign="center" o:hrstd="t" o:hr="t" fillcolor="#a0a0a0" stroked="f"/>
         </w:pict>
       </w:r>
     </w:p>

</xml_diff>